<commit_message>
mmv 20 07 2026
</commit_message>
<xml_diff>
--- a/TS-Kramam/TS-2.3/TS 2.3 Malayalam Krama Paatam Corrections.docx
+++ b/TS-Kramam/TS-2.3/TS 2.3 Malayalam Krama Paatam Corrections.docx
@@ -8,7 +8,6 @@
         <w:rPr>
           <w:b/>
           <w:bCs/>
-          <w:color w:val="EE0000"/>
           <w:sz w:val="32"/>
           <w:szCs w:val="32"/>
           <w:u w:val="single"/>
@@ -88,13 +87,11 @@
         <w:rPr>
           <w:b/>
           <w:bCs/>
-          <w:color w:val="EE0000"/>
           <w:sz w:val="32"/>
           <w:szCs w:val="32"/>
-          <w:highlight w:val="yellow"/>
           <w:u w:val="single"/>
         </w:rPr>
-        <w:t>xxxxxxxxx</w:t>
+        <w:t>31st July 2026</w:t>
       </w:r>
     </w:p>
     <w:p>

</xml_diff>